<commit_message>
Complete video citation with publication date (2025, March 10)
</commit_message>
<xml_diff>
--- a/Week 6/ALY3510_MatthewNaughton_Week6_Fall_2026.docx
+++ b/Week 6/ALY3510_MatthewNaughton_Week6_Fall_2026.docx
@@ -168,7 +168,7 @@
           <w:b w:val="0"/>
           <w:i w:val="0"/>
         </w:rPr>
-        <w:t>Distributed AI can take several forms (Distributed AI Systems, n.d.). Multi-agent systems involve agents cooperating or competing to achieve objectives. Federated learning allows models to train across many devices without combining raw data in a central location. Edge AI brings computation directly to the device generating the data instead of relying on cloud-based processing. In every case, no single system does all the work; intelligence emerges from the interactions among many agents rather than from one central authority. The contrast between the two architectures is shown in Figure 1.</w:t>
+        <w:t>Distributed AI can take several forms (Distributed AI Systems, 2025). Multi-agent systems involve agents cooperating or competing to achieve objectives. Federated learning allows models to train across many devices without combining raw data in a central location. Edge AI brings computation directly to the device generating the data instead of relying on cloud-based processing. In every case, no single system does all the work; intelligence emerges from the interactions among many agents rather than from one central authority. The contrast between the two architectures is shown in Figure 1.</w:t>
       </w:r>
     </w:p>
     <w:p>
@@ -243,7 +243,7 @@
         <w:t xml:space="preserve">Note. </w:t>
       </w:r>
       <w:r>
-        <w:t>In centralized AI, all data routes to one model that makes every decision. In distributed AI, autonomous agents make local decisions and coordinate with one another, so the system continues operating even if individual agents fail. Adapted from concepts in Distributed AI Systems (n.d.) and IBM (n.d.).</w:t>
+        <w:t>In centralized AI, all data routes to one model that makes every decision. In distributed AI, autonomous agents make local decisions and coordinate with one another, so the system continues operating even if individual agents fail. Adapted from concepts in Distributed AI Systems (2025) and IBM (n.d.).</w:t>
       </w:r>
     </w:p>
     <w:p>
@@ -421,7 +421,7 @@
           <w:b w:val="0"/>
           <w:i w:val="0"/>
         </w:rPr>
-        <w:t>Swarm intelligence caught me off guard — the idea, drawn from behaviors like ant colonies and bird flocks, that sophisticated coordination can emerge from many simple agents following local rules, with no central controller (Distributed AI Systems, n.d.). At first the examples reminded me of an assembly line, where each station performs one fixed task in a larger sequence. The more I sat with it, though, the more distributed AI reminded me of a musical ensemble.</w:t>
+        <w:t>Swarm intelligence caught me off guard — the idea, drawn from behaviors like ant colonies and bird flocks, that sophisticated coordination can emerge from many simple agents following local rules, with no central controller (Distributed AI Systems, 2025). At first the examples reminded me of an assembly line, where each station performs one fixed task in a larger sequence. The more I sat with it, though, the more distributed AI reminded me of a musical ensemble.</w:t>
       </w:r>
     </w:p>
     <w:p>
@@ -519,7 +519,7 @@
         <w:rPr>
           <w:i w:val="0"/>
         </w:rPr>
-        <w:t xml:space="preserve"> [Video]. (n.d.). YouTube. https://www.youtube.com/watch?v=cHTvVr1w_7s</w:t>
+        <w:t xml:space="preserve"> [Video]. (2025, March 10). YouTube. https://www.youtube.com/watch?v=cHTvVr1w_7s</w:t>
       </w:r>
     </w:p>
     <w:p>

</xml_diff>

<commit_message>
Finalize video citation: uploader 'AI: The New Era' as author
</commit_message>
<xml_diff>
--- a/Week 6/ALY3510_MatthewNaughton_Week6_Fall_2026.docx
+++ b/Week 6/ALY3510_MatthewNaughton_Week6_Fall_2026.docx
@@ -168,7 +168,7 @@
           <w:b w:val="0"/>
           <w:i w:val="0"/>
         </w:rPr>
-        <w:t>Distributed AI can take several forms (Distributed AI Systems, 2025). Multi-agent systems involve agents cooperating or competing to achieve objectives. Federated learning allows models to train across many devices without combining raw data in a central location. Edge AI brings computation directly to the device generating the data instead of relying on cloud-based processing. In every case, no single system does all the work; intelligence emerges from the interactions among many agents rather than from one central authority. The contrast between the two architectures is shown in Figure 1.</w:t>
+        <w:t>Distributed AI can take several forms (AI: The New Era, 2025). Multi-agent systems involve agents cooperating or competing to achieve objectives. Federated learning allows models to train across many devices without combining raw data in a central location. Edge AI brings computation directly to the device generating the data instead of relying on cloud-based processing. In every case, no single system does all the work; intelligence emerges from the interactions among many agents rather than from one central authority. The contrast between the two architectures is shown in Figure 1.</w:t>
       </w:r>
     </w:p>
     <w:p>
@@ -243,7 +243,7 @@
         <w:t xml:space="preserve">Note. </w:t>
       </w:r>
       <w:r>
-        <w:t>In centralized AI, all data routes to one model that makes every decision. In distributed AI, autonomous agents make local decisions and coordinate with one another, so the system continues operating even if individual agents fail. Adapted from concepts in Distributed AI Systems (2025) and IBM (n.d.).</w:t>
+        <w:t>In centralized AI, all data routes to one model that makes every decision. In distributed AI, autonomous agents make local decisions and coordinate with one another, so the system continues operating even if individual agents fail. Adapted from concepts in AI: The New Era (2025) and IBM (n.d.).</w:t>
       </w:r>
     </w:p>
     <w:p>
@@ -421,7 +421,7 @@
           <w:b w:val="0"/>
           <w:i w:val="0"/>
         </w:rPr>
-        <w:t>Swarm intelligence caught me off guard — the idea, drawn from behaviors like ant colonies and bird flocks, that sophisticated coordination can emerge from many simple agents following local rules, with no central controller (Distributed AI Systems, 2025). At first the examples reminded me of an assembly line, where each station performs one fixed task in a larger sequence. The more I sat with it, though, the more distributed AI reminded me of a musical ensemble.</w:t>
+        <w:t>Swarm intelligence caught me off guard — the idea, drawn from behaviors like ant colonies and bird flocks, that sophisticated coordination can emerge from many simple agents following local rules, with no central controller (AI: The New Era, 2025). At first the examples reminded me of an assembly line, where each station performs one fixed task in a larger sequence. The more I sat with it, though, the more distributed AI reminded me of a musical ensemble.</w:t>
       </w:r>
     </w:p>
     <w:p>
@@ -511,6 +511,12 @@
       </w:pPr>
       <w:r>
         <w:rPr>
+          <w:i w:val="0"/>
+        </w:rPr>
+        <w:t xml:space="preserve">AI: The New Era. (2025, March 10). </w:t>
+      </w:r>
+      <w:r>
+        <w:rPr>
           <w:i/>
         </w:rPr>
         <w:t>Distributed AI systems: The collective intelligence of machines</w:t>
@@ -519,7 +525,7 @@
         <w:rPr>
           <w:i w:val="0"/>
         </w:rPr>
-        <w:t xml:space="preserve"> [Video]. (2025, March 10). YouTube. https://www.youtube.com/watch?v=cHTvVr1w_7s</w:t>
+        <w:t xml:space="preserve"> [Video]. YouTube. https://www.youtube.com/watch?v=cHTvVr1w_7s</w:t>
       </w:r>
     </w:p>
     <w:p>

</xml_diff>

<commit_message>
Merge best-of-both Week 6 revision: restore accountability + emergence, relocate cyberattack story, manage redundancy
</commit_message>
<xml_diff>
--- a/Week 6/ALY3510_MatthewNaughton_Week6_Fall_2026.docx
+++ b/Week 6/ALY3510_MatthewNaughton_Week6_Fall_2026.docx
@@ -117,20 +117,7 @@
           <w:b w:val="0"/>
           <w:i w:val="0"/>
         </w:rPr>
-        <w:t>Most people picture artificial intelligence as a single powerful program running somewhere in the cloud. Distributed AI inverts that model. Rather than relying on one central system to make every decision, it spreads intelligence across many smaller agents that can make decisions locally while still working toward a common goal. These agents may cooperate, share information, or respond to changing conditions without waiting for instructions from a central controller.</w:t>
-      </w:r>
-    </w:p>
-    <w:p>
-      <w:pPr>
-        <w:ind w:firstLine="720"/>
-        <w:jc w:val="left"/>
-      </w:pPr>
-      <w:r>
-        <w:rPr>
-          <w:b w:val="0"/>
-          <w:i w:val="0"/>
-        </w:rPr>
-        <w:t>Coming from facilities engineering, the concept immediately reminded me of how complex systems operate in the real world. Whether it is a building, a utility network, or a maintenance program, success often depends on many specialized components performing their own functions while contributing to a larger objective. This paper explains distributed AI in plain terms, explores two real-world applications that relate to my professional interests, examines one challenge and one advantage of distributed systems, and reflects on a perspective that changed the way I think about distributed intelligence.</w:t>
+        <w:t>Most people picture artificial intelligence as a single powerful program running somewhere in the cloud. Distributed AI takes the “many hands make light work” approach. Rather than relying on one central system to make every decision, it spreads intelligence across many smaller agents that can make decisions locally while still working toward a common goal (AI: The New Era, 2025). As a facilities engineer, I see a lot of parallels with how our operations team, the equipment we depend on, and the systems we use to control and monitor that equipment all work in concert to achieve our objectives. A building is not run by just one brain; it is a collection of systems—chillers, pumps, fire protection, lighting, access control (and the team of human overseers, notwithstanding)—each doing its own job while contributing to the whole. This paper explains distributed AI in plain terms, examines two applications close to my work, and focuses on one challenge, one advantage over centralized AI, and what surprised me most.</w:t>
       </w:r>
     </w:p>
     <w:p>
@@ -155,20 +142,7 @@
           <w:b w:val="0"/>
           <w:i w:val="0"/>
         </w:rPr>
-        <w:t>In a centralized AI system, data is collected in one place, decisions are made by a single model, and instructions are distributed back to the system. Distributed AI replaces that single decision-maker with multiple agents operating across a network. Each agent has access to local information, can make decisions independently, and contributes to the overall behavior of the system (IBM, n.d.).</w:t>
-      </w:r>
-    </w:p>
-    <w:p>
-      <w:pPr>
-        <w:ind w:firstLine="720"/>
-        <w:jc w:val="left"/>
-      </w:pPr>
-      <w:r>
-        <w:rPr>
-          <w:b w:val="0"/>
-          <w:i w:val="0"/>
-        </w:rPr>
-        <w:t>Distributed AI can take several forms (AI: The New Era, 2025). Multi-agent systems involve agents cooperating or competing to achieve objectives. Federated learning allows models to train across many devices without combining raw data in a central location. Edge AI brings computation directly to the device generating the data instead of relying on cloud-based processing. In every case, no single system does all the work; intelligence emerges from the interactions among many agents rather than from one central authority. The contrast between the two architectures is shown in Figure 1.</w:t>
+        <w:t>In a centralized system, every piece of data travels to one model, which makes every decision and sends instructions back. Distributed AI replaces that single decision-maker with a network of agents. Each agent holds its own local information and the authority to act on it, and the “intelligence” emerges from how the agents interact rather than from any one of them (IBM, n.d.). Common approaches include multi-agent systems, where agents cooperate or compete toward objectives; federated learning, where models train across many devices without pooling raw data; and edge AI, where computation happens on the device instead of the cloud (AI: The New Era, 2025). In every case, no single system does all the work. The contrast between the two architectures is shown in Figure 1.</w:t>
       </w:r>
     </w:p>
     <w:p>
@@ -268,33 +242,7 @@
           <w:b w:val="0"/>
           <w:i w:val="0"/>
         </w:rPr>
-        <w:t>Large infrastructure systems are a natural fit for distributed AI: every participant has different information and must act on local conditions, yet the whole still has to stay coordinated. Smart-grid energy management is a clear example.</w:t>
-      </w:r>
-    </w:p>
-    <w:p>
-      <w:pPr>
-        <w:ind w:firstLine="720"/>
-        <w:jc w:val="left"/>
-      </w:pPr>
-      <w:r>
-        <w:rPr>
-          <w:b w:val="0"/>
-          <w:i w:val="0"/>
-        </w:rPr>
-        <w:t>The electric grid is becoming increasingly complex as rooftop solar systems, battery storage, and electric vehicles turn consumers into “prosumers” who both consume and generate power. A single controller cannot effectively manage every home, battery, and charging station in real time. Shojaeighadikolaei et al. (2022) describe a multi-agent deep reinforcement learning framework in which each prosumer operates its own intelligent agent. Those agents decide when to store energy, use it, or sell it back to the grid based on local conditions and pricing information.</w:t>
-      </w:r>
-    </w:p>
-    <w:p>
-      <w:pPr>
-        <w:ind w:firstLine="720"/>
-        <w:jc w:val="left"/>
-      </w:pPr>
-      <w:r>
-        <w:rPr>
-          <w:b w:val="0"/>
-          <w:i w:val="0"/>
-        </w:rPr>
-        <w:t>Instead of one central controller making every decision, each participant responds to the information available to it. The grid operator still provides overall coordination, but the system does not depend on a single decision-maker. In facilities terms, this resembles demand-response strategies where loads can be shifted automatically across many assets rather than requiring manual intervention. Distributed AI allows the system to scale while remaining responsive to local conditions.</w:t>
+        <w:t>The electric grid is getting harder to manage as rooftop solar, battery storage, and EVs turn consumers into “prosumers” who both draw and supply power. A single controller cannot model every home and device in real time, especially with the uncertainty renewables introduce. Shojaeighadikolaei et al. (2022) demonstrate a multi-agent deep reinforcement learning framework in which each prosumer runs its own agent that decides when to store, use, or sell energy based on real-time pricing, while the grid operator coordinates the group. Instead of one central controller trying to manage every home and device, each participant makes local decisions based on things like electricity prices and energy demand. The grid operator still provides coordination, but the system does not depend on a single decision-maker. In facilities terms, this is demand response—when the grid is strained, distributed controls shed or shift load automatically instead of waiting for someone to flip switches.</w:t>
       </w:r>
     </w:p>
     <w:p>
@@ -319,33 +267,7 @@
           <w:b w:val="0"/>
           <w:i w:val="0"/>
         </w:rPr>
-        <w:t>Predictive maintenance is the application that feels most relevant to my day-to-day work. Instead of repairing equipment after failure or replacing components according to a fixed schedule, predictive maintenance uses sensors and analytics to identify problems before they become critical.</w:t>
-      </w:r>
-    </w:p>
-    <w:p>
-      <w:pPr>
-        <w:ind w:firstLine="720"/>
-        <w:jc w:val="left"/>
-      </w:pPr>
-      <w:r>
-        <w:rPr>
-          <w:b w:val="0"/>
-          <w:i w:val="0"/>
-        </w:rPr>
-        <w:t>Fernández-Miguel et al. (2025) describe predictive-maintenance ecosystems built around edge computing, federated learning, and distributed intelligence. Monitoring agents on individual machines analyze equipment conditions locally, detect anomalies, and contribute information to a broader network without necessarily sharing raw operational data.</w:t>
-      </w:r>
-    </w:p>
-    <w:p>
-      <w:pPr>
-        <w:ind w:firstLine="720"/>
-        <w:jc w:val="left"/>
-      </w:pPr>
-      <w:r>
-        <w:rPr>
-          <w:b w:val="0"/>
-          <w:i w:val="0"/>
-        </w:rPr>
-        <w:t>When I am troubleshooting a pump, booster heater, refrigeration system, or other piece of equipment, I am looking for signs that something is operating outside normal conditions. Distributed predictive-maintenance systems are doing something similar, except sensors are collecting information continuously and sharing lessons learned across an entire fleet of equipment. The value of distribution is that decisions can be made close to where the data is generated. A system does not need to wait for every reading to travel to a remote data center before responding to a potential problem. That speed can make a significant difference when preventing costly downtime.</w:t>
+        <w:t>Predictive maintenance hits closest to home. Instead of fixing equipment after it breaks or on a fixed calendar, sensors watch machines for early signs of trouble. Fernández-Miguel et al. (2025) describe predictive-maintenance “ecosystems” built on edge computing, federated learning, and distributed intelligence, where monitoring agents on individual machines detect anomalies locally and organize themselves into a larger network. The problem it solves is unplanned downtime; the agents work together by doing lightweight analysis at the edge and sharing what they learn across sites without exposing raw operational data; and distribution is beneficial because catching a failing bearing or compressor cannot wait for a round trip to the cloud, and no single facility wants to hand over all its data. This is a sharper version of what I do when I troubleshoot a pump or a refrigeration cooler—except the sensing never sleeps and the whole fleet learns from each failure.</w:t>
       </w:r>
     </w:p>
     <w:p>
@@ -370,7 +292,7 @@
           <w:b w:val="0"/>
           <w:i w:val="0"/>
         </w:rPr>
-        <w:t>The biggest practical challenge I see is interoperability. Distributed AI only works if agents can communicate effectively with one another. In the facilities world, it is common to see equipment from different manufacturers connected to software platforms from other vendors, and getting those systems to exchange information reliably can be difficult and expensive. The same problem exists in distributed AI: agents developed by different organizations may use different protocols, assumptions, or communication standards, and without effective integration the benefits of distribution become much harder to realize.</w:t>
+        <w:t>The biggest practical challenge I see is interoperability. Distributed AI only works if the agents can actually talk to each other, and in the real world they often cannot. I see this constantly with building systems: a chiller from one vendor, a building management system from another, and an access-control platform from a third rarely share a common language without expensive integration. We have had tremendous difficulty getting our own building management system to behave; it is always misfiring or miscommunicating, and the result is “alarm fatigue”—a Boy Who Cried Wolf scenario where the people, or agents, who are supposed to act on an alarm start dismissing its veracity. The video raises the same point at the AI level: without standardized protocols, agents from different makers struggle to coordinate (AI: The New Era, 2025).</w:t>
       </w:r>
     </w:p>
     <w:p>
@@ -383,20 +305,7 @@
           <w:b w:val="0"/>
           <w:i w:val="0"/>
         </w:rPr>
-        <w:t>The advantage that stands out most is resilience. In a centralized architecture, failure of a critical controller can disrupt the entire system. In a distributed architecture, individual agents can fail while the rest of the network continues to operate. For applications involving power systems, manufacturing, transportation, or building operations, that fault tolerance is often more valuable than maximizing efficiency.</w:t>
-      </w:r>
-    </w:p>
-    <w:p>
-      <w:pPr>
-        <w:ind w:firstLine="720"/>
-        <w:jc w:val="left"/>
-      </w:pPr>
-      <w:r>
-        <w:rPr>
-          <w:b w:val="0"/>
-          <w:i w:val="0"/>
-        </w:rPr>
-        <w:t>One question that emerged during my research is whether distributed AI also makes accountability more difficult. In a centralized system, it is usually clear where a decision originated. In a distributed system, an outcome may emerge from the interactions of dozens or hundreds of agents. The system may be more resilient, but determining responsibility for a bad decision could become more complicated.</w:t>
+        <w:t>The advantage that stands out is fault tolerance. Because no single hub makes every decision, a distributed system degrades gracefully: if one agent or the central link goes down, the rest keep operating, whereas a centralized system can fail all at once (IBM, n.d.). I saw the value of that firsthand. A couple of years ago we suffered a cyberattack that encrypted our building management system, stripping us of all remote control and visibility—the equipment was still physically running, we just could not command or monitor it through our interfaces. In response, we worked in pairs around the clock, staffing the building and touring the mechanical systems by hand, most critically the chillers and cooling towers that keep the data-center racks cool. When the central brain went dark, resilience came from distributing ourselves across the plant; we effectively became the local agents keeping the physical systems running. For critical infrastructure like power and building safety, that kind of resilience matters more than raw efficiency.</w:t>
       </w:r>
     </w:p>
     <w:p>
@@ -421,33 +330,7 @@
           <w:b w:val="0"/>
           <w:i w:val="0"/>
         </w:rPr>
-        <w:t>Swarm intelligence caught me off guard — the idea, drawn from behaviors like ant colonies and bird flocks, that sophisticated coordination can emerge from many simple agents following local rules, with no central controller (AI: The New Era, 2025). At first the examples reminded me of an assembly line, where each station performs one fixed task in a larger sequence. The more I sat with it, though, the more distributed AI reminded me of a musical ensemble.</w:t>
-      </w:r>
-    </w:p>
-    <w:p>
-      <w:pPr>
-        <w:ind w:firstLine="720"/>
-        <w:jc w:val="left"/>
-      </w:pPr>
-      <w:r>
-        <w:rPr>
-          <w:b w:val="0"/>
-          <w:i w:val="0"/>
-        </w:rPr>
-        <w:t>As a musician, that comparison feels more honest than most technology analogies. In a band or orchestra there may be leadership and structure, but the performance depends on musicians constantly listening, adapting, and responding to one another in real time. No single player controls every note, yet the group produces something coordinated and often creative. The intelligence does not live in any one performer; it emerges from the interaction.</w:t>
-      </w:r>
-    </w:p>
-    <w:p>
-      <w:pPr>
-        <w:ind w:firstLine="720"/>
-        <w:jc w:val="left"/>
-      </w:pPr>
-      <w:r>
-        <w:rPr>
-          <w:b w:val="0"/>
-          <w:i w:val="0"/>
-        </w:rPr>
-        <w:t>That reframing raises a question I keep returning to: are today's distributed AI systems truly collaborative like an ensemble, or are they still closer to an automated assembly line? Most current examples land somewhere in between. Either way, the notion that intelligence can arise from interaction rather than central control was the idea that stayed with me.</w:t>
+        <w:t>What surprised me most was swarm intelligence—the idea, drawn from ant colonies and bird flocks, that complex, coordinated behavior can emerge from simple agents following local rules with no central controller at all (AI: The New Era, 2025). It reframes intelligence as something a group can have: the intelligence does not live in any one agent, but in how they interact. That is also a little unsettling. In a centralized system it is usually clear where a decision came from; in a distributed one, an outcome can emerge from the interactions of dozens or hundreds of agents, which makes the behavior harder to predict and harder to hold accountable when something goes wrong. It is like a game of Telephone, where a small, seemingly innocuous change to the original message can yield a wildly different result by the end—and with no single point to anchor to, how do you course-correct? A better image might be free-form jazz: the music can stray far from any convention until one musician plays something familiar that signals the rest of the group to coalesce around it. Distributed systems may need that kind of beacon to stay coherent.</w:t>
       </w:r>
     </w:p>
     <w:p>
@@ -472,20 +355,7 @@
           <w:b w:val="0"/>
           <w:i w:val="0"/>
         </w:rPr>
-        <w:t>Distributed AI pushes decision-making out to where the data is, rather than routing everything through a central authority. Smart grids use it to balance supply and demand across millions of independent actors, and predictive maintenance uses it to catch failures early while keeping sensitive data local. The payoff is resilience, scalability, and responsiveness; the cost is harder problems in interoperability, accountability, and coordination.</w:t>
-      </w:r>
-    </w:p>
-    <w:p>
-      <w:pPr>
-        <w:ind w:firstLine="720"/>
-        <w:jc w:val="left"/>
-      </w:pPr>
-      <w:r>
-        <w:rPr>
-          <w:b w:val="0"/>
-          <w:i w:val="0"/>
-        </w:rPr>
-        <w:t>Coming from facilities work, the resilience is what I value most. Buildings, utility systems, and maintenance programs tend to succeed because many independent parts keep working toward a shared goal even when one of them fails. But I am not convinced that today's systems deserve the ensemble label yet. Many still look more like an assembly line of specialized agents than a group genuinely adapting to one another. If distributed AI keeps moving toward the ensemble end of that spectrum, its most important feature may not be the intelligence of any single agent, but the intelligence that emerges between them.</w:t>
+        <w:t>Distributed AI pushes decision-making out to where the data is, rather than routing everything through a central authority. In smart grids that keeps supply and demand balanced across millions of independent actors; in predictive maintenance it catches failures early while keeping sensitive data local. The resilience that comes from spreading decisions out is a real advantage over centralized AI, but it only pays off if interoperability and governance keep pace—otherwise coordination breaks down, or no one can say who is accountable when it does. Coming from facilities work, the point that lands hardest is the one the jazz analogy captures: the intelligence that matters in these systems is not in any single agent, but in what emerges between them.</w:t>
       </w:r>
     </w:p>
     <w:p>

</xml_diff>